<commit_message>
Final deck rebuilt in TypeUI Agentic style (Russian), new roles, plainer speech and Q&A, fonts pack
Co-Authored-By: Claude Opus 5.5 <noreply@anthropic.com>
Claude-Session: https://claude.ai/code/session_01EUF3NHuDLbKELtJ28ABXio
</commit_message>
<xml_diff>
--- a/submission/stage2/Saryarqa_Go_AI_Declaration.docx
+++ b/submission/stage2/Saryarqa_Go_AI_Declaration.docx
@@ -1187,7 +1187,7 @@
                 <w:sz w:val="17"/>
                 <w:szCs w:val="17"/>
               </w:rPr>
-              <w:t>AI designed three deck versions in English; we chose version A. AI then translated it fully into Russian (organizers require one language for slides and speech) and relabelled the scenarios.</w:t>
+              <w:t>AI designed three deck versions in English. For the final, AI rebuilt the deck in Russian in the TypeUI "Agentic" style (Playfair Display, Inter, JetBrains Mono), using real Wikimedia photos and screenshots of our prototype, and simplified the slide text.</w:t>
             </w:r>
           </w:p>
         </w:tc>
@@ -1220,7 +1220,7 @@
                 <w:sz w:val="17"/>
                 <w:szCs w:val="17"/>
               </w:rPr>
-              <w:t>Choice of version A and of Russian. [Confirm: edits made by the team.]</w:t>
+              <w:t>Choice of the story, the Russian language, the role split and the style. [Confirm: edits made by the team.]</w:t>
             </w:r>
           </w:p>
         </w:tc>
@@ -1324,7 +1324,7 @@
                 <w:sz w:val="17"/>
                 <w:szCs w:val="17"/>
               </w:rPr>
-              <w:t>AI wrote the Russian speech by slide with timings and short answers to likely jury questions.</w:t>
+              <w:t>AI wrote a first draft of the Russian speech by slide with timings and short answers to likely jury questions.</w:t>
             </w:r>
           </w:p>
         </w:tc>
@@ -1357,7 +1357,7 @@
                 <w:sz w:val="17"/>
                 <w:szCs w:val="17"/>
               </w:rPr>
-              <w:t>[Confirm: final role split; each speaker rewrites their part in their own words.]</w:t>
+              <w:t>Role split: Ikhsan opens and closes, Yeraly market, site and demo, Asylkhan problem and competitors, Ramazan budget. [Confirm: each speaker retells their part in their own words.]</w:t>
             </w:r>
           </w:p>
         </w:tc>

</xml_diff>

<commit_message>
Remove the live demo slide (7 slides); speech extended to about 6 minutes
Co-Authored-By: Claude Opus 5.5 <noreply@anthropic.com>
Claude-Session: https://claude.ai/code/session_01EUF3NHuDLbKELtJ28ABXio
</commit_message>
<xml_diff>
--- a/submission/stage2/Saryarqa_Go_AI_Declaration.docx
+++ b/submission/stage2/Saryarqa_Go_AI_Declaration.docx
@@ -1121,7 +1121,7 @@
                 <w:sz w:val="17"/>
                 <w:szCs w:val="17"/>
               </w:rPr>
-              <w:t>Presentation (final deck, 8 slides, Russian)</w:t>
+              <w:t>Presentation (final deck, 7 slides, Russian)</w:t>
             </w:r>
           </w:p>
         </w:tc>
@@ -1669,7 +1669,7 @@
                 <w:sz w:val="17"/>
                 <w:szCs w:val="17"/>
               </w:rPr>
-              <w:t xml:space="preserve">Backup demo video</w:t>
+              <w:t>Backup demo video</w:t>
             </w:r>
           </w:p>
         </w:tc>
@@ -1702,7 +1702,7 @@
                 <w:sz w:val="17"/>
                 <w:szCs w:val="17"/>
               </w:rPr>
-              <w:t xml:space="preserve">[to confirm]</w:t>
+              <w:t>None</w:t>
             </w:r>
           </w:p>
         </w:tc>
@@ -1735,7 +1735,7 @@
                 <w:sz w:val="17"/>
                 <w:szCs w:val="17"/>
               </w:rPr>
-              <w:t xml:space="preserve">[Fill in once made: screen recording of the real prototype; captions written with AI help.]</w:t>
+              <w:t>Not made: the final pitch has no live demo; the prototype link is on slide 1.</w:t>
             </w:r>
           </w:p>
         </w:tc>
@@ -1768,7 +1768,7 @@
                 <w:sz w:val="17"/>
                 <w:szCs w:val="17"/>
               </w:rPr>
-              <w:t xml:space="preserve">[to confirm]</w:t>
+              <w:t>—</w:t>
             </w:r>
           </w:p>
         </w:tc>

</xml_diff>

<commit_message>
Final package: team name Shredders, QR code on title slide, declaration PDF, MVP link file
Co-Authored-By: Claude Opus 5.5 <noreply@anthropic.com>
Claude-Session: https://claude.ai/code/session_01EUF3NHuDLbKELtJ28ABXio
</commit_message>
<xml_diff>
--- a/submission/stage2/Saryarqa_Go_AI_Declaration.docx
+++ b/submission/stage2/Saryarqa_Go_AI_Declaration.docx
@@ -54,7 +54,7 @@
           <w:sz w:val="20"/>
           <w:szCs w:val="20"/>
         </w:rPr>
-        <w:t xml:space="preserve">[team name — to fill in]   ·   Ikhsan (captain), Yeraly, Asylkhan, Ramazan</w:t>
+        <w:t>Shredders   ·   Ikhsan (captain), Yeraly, Asylkhan, Ramazan</w:t>
       </w:r>
     </w:p>
     <w:p>
@@ -1357,7 +1357,7 @@
                 <w:sz w:val="17"/>
                 <w:szCs w:val="17"/>
               </w:rPr>
-              <w:t>Role split: Ikhsan opens and closes, Yeraly market, site and demo, Asylkhan problem and competitors, Ramazan budget. [Confirm: each speaker retells their part in their own words.]</w:t>
+              <w:t>Role split: Ikhsan opens and closes, Yeraly market and site, Asylkhan problem and competitors, Ramazan budget. [Confirm: each speaker retells their part in their own words.]</w:t>
             </w:r>
           </w:p>
         </w:tc>
@@ -1631,7 +1631,7 @@
                 <w:sz w:val="17"/>
                 <w:szCs w:val="17"/>
               </w:rPr>
-              <w:t xml:space="preserve">[Confirm the final URL in the QR code.]</w:t>
+              <w:t>QR codes on the postcard and on slide 1 decode to https://diawx-6669.github.io/ZERttex/ (checked by decoding).</w:t>
             </w:r>
           </w:p>
         </w:tc>

</xml_diff>

<commit_message>
Final: thank-you slide (8 slides), send-ready AI declaration
Co-Authored-By: Claude Opus 5.5 <noreply@anthropic.com>
Claude-Session: https://claude.ai/code/session_01EUF3NHuDLbKELtJ28ABXio
</commit_message>
<xml_diff>
--- a/submission/stage2/Saryarqa_Go_AI_Declaration.docx
+++ b/submission/stage2/Saryarqa_Go_AI_Declaration.docx
@@ -55,31 +55,6 @@
           <w:szCs w:val="20"/>
         </w:rPr>
         <w:t>Shredders   ·   Ikhsan (captain), Yeraly, Asylkhan, Ramazan</w:t>
-      </w:r>
-    </w:p>
-    <w:p>
-      <w:pPr>
-        <w:spacing w:after="100" w:before="0"/>
-      </w:pPr>
-      <w:r>
-        <w:rPr>
-          <w:rFonts w:ascii="Arial" w:cs="Arial" w:eastAsia="Arial" w:hAnsi="Arial"/>
-          <w:b/>
-          <w:bCs/>
-          <w:color w:val="B3401F"/>
-          <w:sz w:val="20"/>
-          <w:szCs w:val="20"/>
-        </w:rPr>
-        <w:t xml:space="preserve">Fields in [square brackets] must be confirmed by the team before submission. </w:t>
-      </w:r>
-      <w:r>
-        <w:rPr>
-          <w:rFonts w:ascii="Arial" w:cs="Arial" w:eastAsia="Arial" w:hAnsi="Arial"/>
-          <w:color w:val="B3401F"/>
-          <w:sz w:val="20"/>
-          <w:szCs w:val="20"/>
-        </w:rPr>
-        <w:t xml:space="preserve">We did not guess tool names, links or dates we could not verify.</w:t>
       </w:r>
     </w:p>
     <w:p>
@@ -535,7 +510,7 @@
                 <w:sz w:val="17"/>
                 <w:szCs w:val="17"/>
               </w:rPr>
-              <w:t>Which features to add and which stay Phase 2; we tested the demo path ourselves. [Confirm]</w:t>
+              <w:t>Which features to add and which stay Phase 2.</w:t>
             </w:r>
           </w:p>
         </w:tc>
@@ -946,7 +921,7 @@
                 <w:sz w:val="17"/>
                 <w:szCs w:val="17"/>
               </w:rPr>
-              <w:t xml:space="preserve">[Confirm: we opened and checked each link in the sources table.]</w:t>
+              <w:t>Every source is listed with its link and access date in Saryarqa_Go_Sources.xlsx.</w:t>
             </w:r>
           </w:p>
         </w:tc>
@@ -1083,7 +1058,7 @@
                 <w:sz w:val="17"/>
                 <w:szCs w:val="17"/>
               </w:rPr>
-              <w:t>Case cap 20M confirmed by the organizers; choosing to ask for 8M (Phase 1) and a month-9 stage gate was our decision. [Confirm: margin 30%, salary and cost estimates.]</w:t>
+              <w:t>Case cap 20M confirmed by the organizers; choosing to ask for 8M (Phase 1) and a month-9 stage gate was our decision. The 30% margin and the salary and cost estimates are assumptions and are marked as such.</w:t>
             </w:r>
           </w:p>
         </w:tc>
@@ -1220,7 +1195,7 @@
                 <w:sz w:val="17"/>
                 <w:szCs w:val="17"/>
               </w:rPr>
-              <w:t>Choice of the story, the Russian language, the role split and the style. [Confirm: edits made by the team.]</w:t>
+              <w:t>Choice of the story, the Russian language, the role split and the style.</w:t>
             </w:r>
           </w:p>
         </w:tc>
@@ -1357,7 +1332,7 @@
                 <w:sz w:val="17"/>
                 <w:szCs w:val="17"/>
               </w:rPr>
-              <w:t>Role split: Ikhsan opens and closes, Yeraly market and site, Asylkhan problem and competitors, Ramazan budget. [Confirm: each speaker retells their part in their own words.]</w:t>
+              <w:t>Role split: Ikhsan opens and closes, Yeraly market and site, Asylkhan problem and competitors, Ramazan budget. Each speaker presents their own part.</w:t>
             </w:r>
           </w:p>
         </w:tc>
@@ -1669,7 +1644,7 @@
                 <w:sz w:val="17"/>
                 <w:szCs w:val="17"/>
               </w:rPr>
-              <w:t>Backup demo video</w:t>
+              <w:t>Demo video (48 s)</w:t>
             </w:r>
           </w:p>
         </w:tc>
@@ -1702,7 +1677,7 @@
                 <w:sz w:val="17"/>
                 <w:szCs w:val="17"/>
               </w:rPr>
-              <w:t>None</w:t>
+              <w:t>High</w:t>
             </w:r>
           </w:p>
         </w:tc>
@@ -1735,7 +1710,7 @@
                 <w:sz w:val="17"/>
                 <w:szCs w:val="17"/>
               </w:rPr>
-              <w:t>Not made: the final pitch has no live demo; the prototype link is on slide 1.</w:t>
+              <w:t>AI recorded a 48-second video of our real prototype, made the "Shredders" title animation and generated the background music (no third-party music).</w:t>
             </w:r>
           </w:p>
         </w:tc>
@@ -1768,7 +1743,7 @@
                 <w:sz w:val="17"/>
                 <w:szCs w:val="17"/>
               </w:rPr>
-              <w:t>—</w:t>
+              <w:t>Team name, the order of the scenes and the captions.</w:t>
             </w:r>
           </w:p>
         </w:tc>
@@ -2118,7 +2093,7 @@
                 <w:sz w:val="17"/>
                 <w:szCs w:val="17"/>
               </w:rPr>
-              <w:t>[Session link — to add]</w:t>
+              <w:t>—</w:t>
             </w:r>
           </w:p>
         </w:tc>
@@ -2222,111 +2197,7 @@
                 <w:sz w:val="17"/>
                 <w:szCs w:val="17"/>
               </w:rPr>
-              <w:t>[Session links — confirm they open for the jury: https://claude.ai/code/session_01PaavcCWMyR6fzcZcdCKTuP · https://claude.ai/code/session_01EUF3NHuDLbKELtJ28ABXio]</w:t>
-            </w:r>
-          </w:p>
-        </w:tc>
-      </w:tr>
-      <w:tr>
-        <w:trPr>
-          <w:tblHeader w:val="off"/>
-        </w:trPr>
-        <w:tc>
-          <w:tcPr>
-            <w:tcW w:type="dxa" w:w="3000"/>
-            <w:tcBorders>
-              <w:top w:val="single" w:color="C9CFD5" w:sz="4"/>
-              <w:left w:val="single" w:color="C9CFD5" w:sz="4"/>
-              <w:bottom w:val="single" w:color="C9CFD5" w:sz="4"/>
-              <w:right w:val="single" w:color="C9CFD5" w:sz="4"/>
-            </w:tcBorders>
-            <w:tcMar>
-              <w:top w:type="dxa" w:w="60"/>
-              <w:left w:type="dxa" w:w="90"/>
-              <w:bottom w:type="dxa" w:w="60"/>
-              <w:right w:type="dxa" w:w="90"/>
-            </w:tcMar>
-          </w:tcPr>
-          <w:p>
-            <w:pPr>
-              <w:spacing w:after="0"/>
-            </w:pPr>
-            <w:r>
-              <w:rPr>
-                <w:rFonts w:ascii="Arial" w:cs="Arial" w:eastAsia="Arial" w:hAnsi="Arial"/>
-                <w:b/>
-                <w:bCs/>
-                <w:color w:val="1F242B"/>
-                <w:sz w:val="17"/>
-                <w:szCs w:val="17"/>
-              </w:rPr>
-              <w:t xml:space="preserve">[Other tools, if any — e.g. Canva, ChatGPT, DeepL]</w:t>
-            </w:r>
-          </w:p>
-        </w:tc>
-        <w:tc>
-          <w:tcPr>
-            <w:tcW w:type="dxa" w:w="3900"/>
-            <w:tcBorders>
-              <w:top w:val="single" w:color="C9CFD5" w:sz="4"/>
-              <w:left w:val="single" w:color="C9CFD5" w:sz="4"/>
-              <w:bottom w:val="single" w:color="C9CFD5" w:sz="4"/>
-              <w:right w:val="single" w:color="C9CFD5" w:sz="4"/>
-            </w:tcBorders>
-            <w:tcMar>
-              <w:top w:type="dxa" w:w="60"/>
-              <w:left w:type="dxa" w:w="90"/>
-              <w:bottom w:type="dxa" w:w="60"/>
-              <w:right w:type="dxa" w:w="90"/>
-            </w:tcMar>
-          </w:tcPr>
-          <w:p>
-            <w:pPr>
-              <w:spacing w:after="0"/>
-            </w:pPr>
-            <w:r>
-              <w:rPr>
-                <w:rFonts w:ascii="Arial" w:cs="Arial" w:eastAsia="Arial" w:hAnsi="Arial"/>
-                <w:b w:val="false"/>
-                <w:bCs w:val="false"/>
-                <w:color w:val="1F242B"/>
-                <w:sz w:val="17"/>
-                <w:szCs w:val="17"/>
-              </w:rPr>
-              <w:t xml:space="preserve">[what for]</w:t>
-            </w:r>
-          </w:p>
-        </w:tc>
-        <w:tc>
-          <w:tcPr>
-            <w:tcW w:type="dxa" w:w="2738"/>
-            <w:tcBorders>
-              <w:top w:val="single" w:color="C9CFD5" w:sz="4"/>
-              <w:left w:val="single" w:color="C9CFD5" w:sz="4"/>
-              <w:bottom w:val="single" w:color="C9CFD5" w:sz="4"/>
-              <w:right w:val="single" w:color="C9CFD5" w:sz="4"/>
-            </w:tcBorders>
-            <w:tcMar>
-              <w:top w:type="dxa" w:w="60"/>
-              <w:left w:type="dxa" w:w="90"/>
-              <w:bottom w:type="dxa" w:w="60"/>
-              <w:right w:type="dxa" w:w="90"/>
-            </w:tcMar>
-          </w:tcPr>
-          <w:p>
-            <w:pPr>
-              <w:spacing w:after="0"/>
-            </w:pPr>
-            <w:r>
-              <w:rPr>
-                <w:rFonts w:ascii="Arial" w:cs="Arial" w:eastAsia="Arial" w:hAnsi="Arial"/>
-                <w:b w:val="false"/>
-                <w:bCs w:val="false"/>
-                <w:color w:val="1F242B"/>
-                <w:sz w:val="17"/>
-                <w:szCs w:val="17"/>
-              </w:rPr>
-              <w:t xml:space="preserve">[link]</w:t>
+              <w:t>https://claude.ai/code/session_01PaavcCWMyR6fzcZcdCKTuP · https://claude.ai/code/session_01EUF3NHuDLbKELtJ28ABXio</w:t>
             </w:r>
           </w:p>
         </w:tc>
@@ -2461,25 +2332,6 @@
           <w:szCs w:val="20"/>
         </w:rPr>
         <w:t xml:space="preserve">Competitor facts were checked on the live pages on 27 Oct 2026 (Trip.com listing, payment methods, company profile).</w:t>
-      </w:r>
-    </w:p>
-    <w:p>
-      <w:pPr>
-        <w:pStyle w:val="ListParagraph"/>
-        <w:numPr>
-          <w:ilvl w:val="0"/>
-          <w:numId w:val="2"/>
-        </w:numPr>
-        <w:spacing w:after="60"/>
-      </w:pPr>
-      <w:r>
-        <w:rPr>
-          <w:rFonts w:ascii="Arial" w:cs="Arial" w:eastAsia="Arial" w:hAnsi="Arial"/>
-          <w:color w:val="1F242B"/>
-          <w:sz w:val="20"/>
-          <w:szCs w:val="20"/>
-        </w:rPr>
-        <w:t xml:space="preserve">[Team: confirm that at least one member opened each source link and that the numbers match.]</w:t>
       </w:r>
     </w:p>
     <w:p>

</xml_diff>